<commit_message>
add updates to nbs and docx
</commit_message>
<xml_diff>
--- a/docs/Multi-Agent_Load_Balancing_and_Collaboration_via_Reinforcement_Learning.docx
+++ b/docs/Multi-Agent_Load_Balancing_and_Collaboration_via_Reinforcement_Learning.docx
@@ -812,7 +812,25 @@
                 <w:sz w:val="20"/>
                 <w:szCs w:val="20"/>
               </w:rPr>
-              <w:t>Train the PPO Model</w:t>
+              <w:t>Train the PPO Mo</w:t>
+            </w:r>
+            <w:r>
+              <w:rPr>
+                <w:rStyle w:val="Hyperlink"/>
+                <w:noProof/>
+                <w:sz w:val="20"/>
+                <w:szCs w:val="20"/>
+              </w:rPr>
+              <w:t>d</w:t>
+            </w:r>
+            <w:r>
+              <w:rPr>
+                <w:rStyle w:val="Hyperlink"/>
+                <w:noProof/>
+                <w:sz w:val="20"/>
+                <w:szCs w:val="20"/>
+              </w:rPr>
+              <w:t>el</w:t>
             </w:r>
             <w:r>
               <w:rPr>
@@ -1755,7 +1773,43 @@
                 <w:sz w:val="20"/>
                 <w:szCs w:val="20"/>
               </w:rPr>
-              <w:t>System Flowchart</w:t>
+              <w:t>System Flo</w:t>
+            </w:r>
+            <w:r>
+              <w:rPr>
+                <w:rStyle w:val="Hyperlink"/>
+                <w:noProof/>
+                <w:sz w:val="20"/>
+                <w:szCs w:val="20"/>
+              </w:rPr>
+              <w:t>w</w:t>
+            </w:r>
+            <w:r>
+              <w:rPr>
+                <w:rStyle w:val="Hyperlink"/>
+                <w:noProof/>
+                <w:sz w:val="20"/>
+                <w:szCs w:val="20"/>
+              </w:rPr>
+              <w:t>c</w:t>
+            </w:r>
+            <w:r>
+              <w:rPr>
+                <w:rStyle w:val="Hyperlink"/>
+                <w:noProof/>
+                <w:sz w:val="20"/>
+                <w:szCs w:val="20"/>
+              </w:rPr>
+              <w:t>h</w:t>
+            </w:r>
+            <w:r>
+              <w:rPr>
+                <w:rStyle w:val="Hyperlink"/>
+                <w:noProof/>
+                <w:sz w:val="20"/>
+                <w:szCs w:val="20"/>
+              </w:rPr>
+              <w:t>art</w:t>
             </w:r>
             <w:r>
               <w:rPr>
@@ -1933,7 +1987,16 @@
                 <w:sz w:val="20"/>
                 <w:szCs w:val="20"/>
               </w:rPr>
-              <w:t>Training Loop</w:t>
+              <w:t>Training Loo</w:t>
+            </w:r>
+            <w:r>
+              <w:rPr>
+                <w:rStyle w:val="Hyperlink"/>
+                <w:noProof/>
+                <w:sz w:val="20"/>
+                <w:szCs w:val="20"/>
+              </w:rPr>
+              <w:t>p</w:t>
             </w:r>
             <w:r>
               <w:rPr>
@@ -2016,7 +2079,21 @@
                 <w:rStyle w:val="Hyperlink"/>
                 <w:noProof/>
               </w:rPr>
-              <w:t>Parallel Vectorized Environments</w:t>
+              <w:t>Parallel V</w:t>
+            </w:r>
+            <w:r>
+              <w:rPr>
+                <w:rStyle w:val="Hyperlink"/>
+                <w:noProof/>
+              </w:rPr>
+              <w:t>e</w:t>
+            </w:r>
+            <w:r>
+              <w:rPr>
+                <w:rStyle w:val="Hyperlink"/>
+                <w:noProof/>
+              </w:rPr>
+              <w:t>ctorized Environments</w:t>
             </w:r>
             <w:r>
               <w:rPr>
@@ -2819,7 +2896,25 @@
                 <w:sz w:val="20"/>
                 <w:szCs w:val="20"/>
               </w:rPr>
-              <w:t>References</w:t>
+              <w:t>Referen</w:t>
+            </w:r>
+            <w:r>
+              <w:rPr>
+                <w:rStyle w:val="Hyperlink"/>
+                <w:noProof/>
+                <w:sz w:val="20"/>
+                <w:szCs w:val="20"/>
+              </w:rPr>
+              <w:t>c</w:t>
+            </w:r>
+            <w:r>
+              <w:rPr>
+                <w:rStyle w:val="Hyperlink"/>
+                <w:noProof/>
+                <w:sz w:val="20"/>
+                <w:szCs w:val="20"/>
+              </w:rPr>
+              <w:t>es</w:t>
             </w:r>
             <w:r>
               <w:rPr>
@@ -13253,61 +13348,209 @@
       </w:r>
       <w:bookmarkEnd w:id="9"/>
     </w:p>
-    <w:p>
-      <w:r>
+    <w:p/>
+    <w:p>
+      <w:pPr>
+        <w:rPr>
+          <w:rFonts w:ascii="Consolas" w:hAnsi="Consolas" w:cs="Consolas"/>
+          <w:sz w:val="18"/>
+          <w:szCs w:val="18"/>
+        </w:rPr>
+      </w:pPr>
+      <w:r>
+        <w:rPr>
+          <w:rFonts w:ascii="Consolas" w:hAnsi="Consolas" w:cs="Consolas"/>
+          <w:sz w:val="18"/>
+          <w:szCs w:val="18"/>
+        </w:rPr>
         <w:t>def train(self, total_timesteps: int = 100000):</w:t>
       </w:r>
     </w:p>
     <w:p>
-      <w:r>
+      <w:pPr>
+        <w:rPr>
+          <w:rFonts w:ascii="Consolas" w:hAnsi="Consolas" w:cs="Consolas"/>
+          <w:sz w:val="18"/>
+          <w:szCs w:val="18"/>
+        </w:rPr>
+      </w:pPr>
+      <w:r>
+        <w:rPr>
+          <w:rFonts w:ascii="Consolas" w:hAnsi="Consolas" w:cs="Consolas"/>
+          <w:sz w:val="18"/>
+          <w:szCs w:val="18"/>
+        </w:rPr>
         <w:t xml:space="preserve">        """Train the multi-agent system"""</w:t>
       </w:r>
     </w:p>
     <w:p>
-      <w:r>
+      <w:pPr>
+        <w:rPr>
+          <w:rFonts w:ascii="Consolas" w:hAnsi="Consolas" w:cs="Consolas"/>
+          <w:sz w:val="18"/>
+          <w:szCs w:val="18"/>
+        </w:rPr>
+      </w:pPr>
+      <w:r>
+        <w:rPr>
+          <w:rFonts w:ascii="Consolas" w:hAnsi="Consolas" w:cs="Consolas"/>
+          <w:sz w:val="18"/>
+          <w:szCs w:val="18"/>
+        </w:rPr>
         <w:t xml:space="preserve">        logger.info(f"Starting training for {total_timesteps} timesteps")</w:t>
       </w:r>
     </w:p>
-    <w:p/>
-    <w:p>
-      <w:r>
+    <w:p>
+      <w:pPr>
+        <w:rPr>
+          <w:rFonts w:ascii="Consolas" w:hAnsi="Consolas" w:cs="Consolas"/>
+          <w:sz w:val="18"/>
+          <w:szCs w:val="18"/>
+        </w:rPr>
+      </w:pPr>
+    </w:p>
+    <w:p>
+      <w:pPr>
+        <w:rPr>
+          <w:rFonts w:ascii="Consolas" w:hAnsi="Consolas" w:cs="Consolas"/>
+          <w:sz w:val="18"/>
+          <w:szCs w:val="18"/>
+        </w:rPr>
+      </w:pPr>
+      <w:r>
+        <w:rPr>
+          <w:rFonts w:ascii="Consolas" w:hAnsi="Consolas" w:cs="Consolas"/>
+          <w:sz w:val="18"/>
+          <w:szCs w:val="18"/>
+        </w:rPr>
         <w:t xml:space="preserve">        self.model.learn(</w:t>
       </w:r>
     </w:p>
     <w:p>
-      <w:r>
+      <w:pPr>
+        <w:rPr>
+          <w:rFonts w:ascii="Consolas" w:hAnsi="Consolas" w:cs="Consolas"/>
+          <w:sz w:val="18"/>
+          <w:szCs w:val="18"/>
+        </w:rPr>
+      </w:pPr>
+      <w:r>
+        <w:rPr>
+          <w:rFonts w:ascii="Consolas" w:hAnsi="Consolas" w:cs="Consolas"/>
+          <w:sz w:val="18"/>
+          <w:szCs w:val="18"/>
+        </w:rPr>
         <w:t xml:space="preserve">            total_timesteps=total_timesteps,</w:t>
       </w:r>
     </w:p>
     <w:p>
-      <w:r>
+      <w:pPr>
+        <w:rPr>
+          <w:rFonts w:ascii="Consolas" w:hAnsi="Consolas" w:cs="Consolas"/>
+          <w:sz w:val="18"/>
+          <w:szCs w:val="18"/>
+        </w:rPr>
+      </w:pPr>
+      <w:r>
+        <w:rPr>
+          <w:rFonts w:ascii="Consolas" w:hAnsi="Consolas" w:cs="Consolas"/>
+          <w:sz w:val="18"/>
+          <w:szCs w:val="18"/>
+        </w:rPr>
         <w:t xml:space="preserve">            callback=self.callbacks,</w:t>
       </w:r>
     </w:p>
     <w:p>
-      <w:r>
+      <w:pPr>
+        <w:rPr>
+          <w:rFonts w:ascii="Consolas" w:hAnsi="Consolas" w:cs="Consolas"/>
+          <w:sz w:val="18"/>
+          <w:szCs w:val="18"/>
+        </w:rPr>
+      </w:pPr>
+      <w:r>
+        <w:rPr>
+          <w:rFonts w:ascii="Consolas" w:hAnsi="Consolas" w:cs="Consolas"/>
+          <w:sz w:val="18"/>
+          <w:szCs w:val="18"/>
+        </w:rPr>
         <w:t xml:space="preserve">            log_interval=10,</w:t>
       </w:r>
     </w:p>
     <w:p>
-      <w:r>
+      <w:pPr>
+        <w:rPr>
+          <w:rFonts w:ascii="Consolas" w:hAnsi="Consolas" w:cs="Consolas"/>
+          <w:sz w:val="18"/>
+          <w:szCs w:val="18"/>
+        </w:rPr>
+      </w:pPr>
+      <w:r>
+        <w:rPr>
+          <w:rFonts w:ascii="Consolas" w:hAnsi="Consolas" w:cs="Consolas"/>
+          <w:sz w:val="18"/>
+          <w:szCs w:val="18"/>
+        </w:rPr>
         <w:t xml:space="preserve">            progress_bar=True</w:t>
       </w:r>
     </w:p>
     <w:p>
-      <w:r>
+      <w:pPr>
+        <w:rPr>
+          <w:rFonts w:ascii="Consolas" w:hAnsi="Consolas" w:cs="Consolas"/>
+          <w:sz w:val="18"/>
+          <w:szCs w:val="18"/>
+        </w:rPr>
+      </w:pPr>
+      <w:r>
+        <w:rPr>
+          <w:rFonts w:ascii="Consolas" w:hAnsi="Consolas" w:cs="Consolas"/>
+          <w:sz w:val="18"/>
+          <w:szCs w:val="18"/>
+        </w:rPr>
         <w:t xml:space="preserve">        )</w:t>
       </w:r>
     </w:p>
-    <w:p/>
-    <w:p>
-      <w:r>
+    <w:p>
+      <w:pPr>
+        <w:rPr>
+          <w:rFonts w:ascii="Consolas" w:hAnsi="Consolas" w:cs="Consolas"/>
+          <w:sz w:val="18"/>
+          <w:szCs w:val="18"/>
+        </w:rPr>
+      </w:pPr>
+    </w:p>
+    <w:p>
+      <w:pPr>
+        <w:rPr>
+          <w:rFonts w:ascii="Consolas" w:hAnsi="Consolas" w:cs="Consolas"/>
+          <w:sz w:val="18"/>
+          <w:szCs w:val="18"/>
+        </w:rPr>
+      </w:pPr>
+      <w:r>
+        <w:rPr>
+          <w:rFonts w:ascii="Consolas" w:hAnsi="Consolas" w:cs="Consolas"/>
+          <w:sz w:val="18"/>
+          <w:szCs w:val="18"/>
+        </w:rPr>
         <w:t xml:space="preserve">        logger.info("Training completed")</w:t>
       </w:r>
     </w:p>
     <w:p>
-      <w:r>
-        <w:lastRenderedPageBreak/>
+      <w:pPr>
+        <w:rPr>
+          <w:rFonts w:ascii="Consolas" w:hAnsi="Consolas" w:cs="Consolas"/>
+          <w:sz w:val="18"/>
+          <w:szCs w:val="18"/>
+        </w:rPr>
+      </w:pPr>
+      <w:r>
+        <w:rPr>
+          <w:rFonts w:ascii="Consolas" w:hAnsi="Consolas" w:cs="Consolas"/>
+          <w:sz w:val="18"/>
+          <w:szCs w:val="18"/>
+        </w:rPr>
         <w:t xml:space="preserve">        return self.model</w:t>
       </w:r>
     </w:p>
@@ -13625,7 +13868,6 @@
     <w:p/>
     <w:p>
       <w:r>
-        <w:lastRenderedPageBreak/>
         <w:t xml:space="preserve">3. </w:t>
       </w:r>
       <w:r>
@@ -13638,6 +13880,7 @@
     </w:p>
     <w:p>
       <w:r>
+        <w:lastRenderedPageBreak/>
         <w:t>When two agents both signal high collaboration intent (action value &gt; 0.7), the system:</w:t>
       </w:r>
     </w:p>
@@ -16475,6 +16718,9 @@
         <w:t>System Flowchart</w:t>
       </w:r>
       <w:bookmarkEnd w:id="20"/>
+      <w:r>
+        <w:t xml:space="preserve"> and Training Process</w:t>
+      </w:r>
     </w:p>
     <w:p/>
     <w:p>
@@ -16817,6 +17063,7 @@
       </w:r>
     </w:p>
     <w:p/>
+    <w:p/>
     <w:p>
       <w:pPr>
         <w:pStyle w:val="Heading3"/>
@@ -17231,7 +17478,6 @@
       </w:pPr>
       <w:bookmarkStart w:id="25" w:name="_Toc220903319"/>
       <w:r>
-        <w:lastRenderedPageBreak/>
         <w:t>Key PPO hyperparameters</w:t>
       </w:r>
       <w:bookmarkEnd w:id="25"/>
@@ -17764,6 +18010,7 @@
       </w:pPr>
       <w:bookmarkStart w:id="28" w:name="_Toc220903322"/>
       <w:r>
+        <w:lastRenderedPageBreak/>
         <w:t>Task Driven Work Distribution</w:t>
       </w:r>
       <w:bookmarkEnd w:id="28"/>
@@ -17774,7 +18021,6 @@
         <w:rPr>
           <w:noProof/>
         </w:rPr>
-        <w:lastRenderedPageBreak/>
         <w:drawing>
           <wp:anchor distT="0" distB="0" distL="114300" distR="114300" simplePos="0" relativeHeight="251712512" behindDoc="0" locked="0" layoutInCell="1" allowOverlap="1" wp14:anchorId="6A940DCA" wp14:editId="29DBB561">
             <wp:simplePos x="0" y="0"/>
@@ -18630,7 +18876,7 @@
           </mc:Choice>
           <mc:Fallback>
             <w:pict>
-              <v:shape w14:anchorId="35994B1B" id="Freeform 27" o:spid="_x0000_s1026" style="position:absolute;margin-left:-43.3pt;margin-top:111pt;width:524.4pt;height:166.05pt;z-index:251703296;visibility:visible;mso-wrap-style:square;mso-height-percent:0;mso-wrap-distance-left:9pt;mso-wrap-distance-top:0;mso-wrap-distance-right:9pt;mso-wrap-distance-bottom:0;mso-position-horizontal:absolute;mso-position-horizontal-relative:text;mso-position-vertical:absolute;mso-position-vertical-relative:text;mso-height-percent:0;mso-height-relative:margin;v-text-anchor:middle" coordsize="6660186,2143785" o:gfxdata="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" path="m6480510,1559v12451,-2491,24902,-4981,53788,17929c6563184,42398,6638886,101167,6653827,139018v14941,37851,2988,75702,-29882,107576c6591075,278468,6541271,305363,6456604,330265v-84667,24902,-254000,52792,-340659,65741c6029286,408955,5936651,407959,5936651,407959r-484094,29882l5087992,461747v-132478,6972,-281890,13945,-430306,17929c4509270,483660,4375796,480673,4197498,485653v-178298,4980,-609600,23906,-609600,23906l3121733,521512r-806823,5976l1806910,539441r-645459,5977c959247,550398,740109,555378,593686,569323,447262,583268,367577,604186,282910,629088,198243,653990,132502,656978,85686,718735,38870,780492,10981,887072,2016,999629v-8965,112557,13945,281890,29882,394447c47835,1506633,70745,1592296,97639,1674970v26894,82674,58769,153396,95624,215153c230118,1951880,268965,2004673,318769,2045512v49804,40839,129490,74706,173317,89647c535913,2150100,558823,2142629,581733,2135159e" filled="f" strokecolor="#030e13 [484]" strokeweight=".5pt">
+              <v:shape w14:anchorId="51227AB5" id="Freeform 27" o:spid="_x0000_s1026" style="position:absolute;margin-left:-43.3pt;margin-top:111pt;width:524.4pt;height:166.05pt;z-index:251703296;visibility:visible;mso-wrap-style:square;mso-height-percent:0;mso-wrap-distance-left:9pt;mso-wrap-distance-top:0;mso-wrap-distance-right:9pt;mso-wrap-distance-bottom:0;mso-position-horizontal:absolute;mso-position-horizontal-relative:text;mso-position-vertical:absolute;mso-position-vertical-relative:text;mso-height-percent:0;mso-height-relative:margin;v-text-anchor:middle" coordsize="6660186,2143785" o:gfxdata="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" path="m6480510,1559v12451,-2491,24902,-4981,53788,17929c6563184,42398,6638886,101167,6653827,139018v14941,37851,2988,75702,-29882,107576c6591075,278468,6541271,305363,6456604,330265v-84667,24902,-254000,52792,-340659,65741c6029286,408955,5936651,407959,5936651,407959r-484094,29882l5087992,461747v-132478,6972,-281890,13945,-430306,17929c4509270,483660,4375796,480673,4197498,485653v-178298,4980,-609600,23906,-609600,23906l3121733,521512r-806823,5976l1806910,539441r-645459,5977c959247,550398,740109,555378,593686,569323,447262,583268,367577,604186,282910,629088,198243,653990,132502,656978,85686,718735,38870,780492,10981,887072,2016,999629v-8965,112557,13945,281890,29882,394447c47835,1506633,70745,1592296,97639,1674970v26894,82674,58769,153396,95624,215153c230118,1951880,268965,2004673,318769,2045512v49804,40839,129490,74706,173317,89647c535913,2150100,558823,2142629,581733,2135159e" filled="f" strokecolor="#030e13 [484]" strokeweight=".5pt">
                 <v:stroke opacity="34181f" joinstyle="miter"/>
                 <v:path arrowok="t" o:connecttype="custom" o:connectlocs="6480510,1534;6534298,19171;6653827,136759;6623945,242587;6456604,324898;6115945,389571;5936651,401329;5452557,430726;5087992,454243;4657686,471881;4197498,477761;3587898,501278;3121733,513037;2314910,518916;1806910,530675;1161451,536555;593686,560071;282910,618865;85686,707055;2016,983384;31898,1371421;97639,1647751;193263,1859407;318769,2012271;492086,2100461;581733,2100461" o:connectangles="0,0,0,0,0,0,0,0,0,0,0,0,0,0,0,0,0,0,0,0,0,0,0,0,0,0"/>
               </v:shape>
@@ -18998,7 +19244,7 @@
           </mc:Choice>
           <mc:Fallback>
             <w:pict>
-              <v:shape w14:anchorId="45F2A872" id="Freeform 26" o:spid="_x0000_s1026" style="position:absolute;margin-left:-26.6pt;margin-top:62pt;width:519.5pt;height:160.95pt;z-index:251702272;visibility:visible;mso-wrap-style:square;mso-wrap-distance-left:9pt;mso-wrap-distance-top:0;mso-wrap-distance-right:9pt;mso-wrap-distance-bottom:0;mso-position-horizontal:absolute;mso-position-horizontal-relative:text;mso-position-vertical:absolute;mso-position-vertical-relative:text;v-text-anchor:middle" coordsize="6597555,2043953" o:gfxdata="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" path="m6284303,v79188,69227,158377,138454,203200,197223c6532327,255992,6535315,291851,6553244,352612v17930,60761,35860,148415,41836,209176c6601056,622549,6595079,659404,6589103,717176v-5976,57772,-11953,130486,-29882,191247c6541292,969184,6519378,1037913,6481527,1081741v-37851,43828,-149412,89647,-149412,89647l6332115,1171388v-57773,7969,-240055,35859,-346635,47812c5878900,1231153,5820131,1236133,5692633,1243106v-127498,6973,-472142,17929,-472142,17929l4826044,1272988r-406400,11953l3750280,1290917r-621553,5977l2507174,1302870r-567765,5977l1574844,1314823r-472141,5977l612633,1332753v-130486,2988,-216149,1992,-292847,5976c243088,1342713,203244,1328769,152444,1356659v-50800,27890,-113552,94627,-137458,149411c-8920,1560854,1041,1629584,9009,1685364v7968,55780,31874,113554,53788,155389c84711,1882588,116585,1908486,140491,1936376v23906,27890,40840,55781,65742,71718c231135,2024031,265001,2026024,289903,2032000v24902,5976,45321,8964,65741,11953e" filled="f" strokecolor="#030e13 [484]" strokeweight=".5pt">
+              <v:shape w14:anchorId="5FEC5CBD" id="Freeform 26" o:spid="_x0000_s1026" style="position:absolute;margin-left:-26.6pt;margin-top:62pt;width:519.5pt;height:160.95pt;z-index:251702272;visibility:visible;mso-wrap-style:square;mso-wrap-distance-left:9pt;mso-wrap-distance-top:0;mso-wrap-distance-right:9pt;mso-wrap-distance-bottom:0;mso-position-horizontal:absolute;mso-position-horizontal-relative:text;mso-position-vertical:absolute;mso-position-vertical-relative:text;v-text-anchor:middle" coordsize="6597555,2043953" o:gfxdata="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" path="m6284303,v79188,69227,158377,138454,203200,197223c6532327,255992,6535315,291851,6553244,352612v17930,60761,35860,148415,41836,209176c6601056,622549,6595079,659404,6589103,717176v-5976,57772,-11953,130486,-29882,191247c6541292,969184,6519378,1037913,6481527,1081741v-37851,43828,-149412,89647,-149412,89647l6332115,1171388v-57773,7969,-240055,35859,-346635,47812c5878900,1231153,5820131,1236133,5692633,1243106v-127498,6973,-472142,17929,-472142,17929l4826044,1272988r-406400,11953l3750280,1290917r-621553,5977l2507174,1302870r-567765,5977l1574844,1314823r-472141,5977l612633,1332753v-130486,2988,-216149,1992,-292847,5976c243088,1342713,203244,1328769,152444,1356659v-50800,27890,-113552,94627,-137458,149411c-8920,1560854,1041,1629584,9009,1685364v7968,55780,31874,113554,53788,155389c84711,1882588,116585,1908486,140491,1936376v23906,27890,40840,55781,65742,71718c231135,2024031,265001,2026024,289903,2032000v24902,5976,45321,8964,65741,11953e" filled="f" strokecolor="#030e13 [484]" strokeweight=".5pt">
                 <v:stroke opacity="34695f" joinstyle="miter"/>
                 <v:path arrowok="t" o:connecttype="custom" o:connectlocs="6284303,0;6487503,197223;6553244,352612;6595080,561788;6589103,717176;6559221,908423;6481527,1081741;6332115,1171388;6332115,1171388;5985480,1219200;5692633,1243106;5220491,1261035;4826044,1272988;4419644,1284941;3750280,1290917;3128727,1296894;2507174,1302870;1939409,1308847;1574844,1314823;1102703,1320800;612633,1332753;319786,1338729;152444,1356659;14986,1506070;9009,1685364;62797,1840753;140491,1936376;206233,2008094;289903,2032000;355644,2043953" o:connectangles="0,0,0,0,0,0,0,0,0,0,0,0,0,0,0,0,0,0,0,0,0,0,0,0,0,0,0,0,0,0"/>
               </v:shape>
@@ -19408,7 +19654,7 @@
           </mc:Choice>
           <mc:Fallback>
             <w:pict>
-              <v:shape w14:anchorId="57844A84" id="Freeform 29" o:spid="_x0000_s1026" style="position:absolute;margin-left:-44.3pt;margin-top:113.7pt;width:525.4pt;height:165.1pt;z-index:251705344;visibility:visible;mso-wrap-style:square;mso-wrap-distance-left:9pt;mso-wrap-distance-top:0;mso-wrap-distance-right:9pt;mso-wrap-distance-bottom:0;mso-position-horizontal:absolute;mso-position-horizontal-relative:text;mso-position-vertical:absolute;mso-position-vertical-relative:text;v-text-anchor:middle" coordsize="6672793,2097040" o:gfxdata="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" path="m6503202,9526v28886,-6973,57772,-13945,83670,-5976c6612770,11519,6644645,20483,6658590,57338v13945,36855,16933,94627,11953,167341c6665563,297393,6660582,421902,6628708,493620v-31874,71718,-66738,128494,-149412,161365c6396622,687856,6281077,683872,6132661,690844v-148416,6972,-351616,6972,-543859,5976c5396559,695824,4979202,684868,4979202,684868r-573741,-5977l3777931,666938v-197224,-1992,-555812,,-555812,l2600566,666938r-663388,l1214025,660962c1003853,657974,843484,638052,676143,649009,508802,659966,316558,673911,209978,726703,103398,779495,71524,868146,36661,965762,1798,1063378,-2186,1205817,802,1312397v2988,106580,30878,204196,53788,292847c77500,1693895,104394,1784538,138261,1844303v33867,59765,85662,87655,119529,119529c291657,1995706,310582,2016625,341461,2035550v30878,18926,72714,31874,101600,41835c471947,2087346,493860,2092327,514778,2095315v20918,2988,37353,1494,53788,e" filled="f" strokecolor="#030e13 [484]" strokeweight=".5pt">
+              <v:shape w14:anchorId="51E2E59F" id="Freeform 29" o:spid="_x0000_s1026" style="position:absolute;margin-left:-44.3pt;margin-top:113.7pt;width:525.4pt;height:165.1pt;z-index:251705344;visibility:visible;mso-wrap-style:square;mso-wrap-distance-left:9pt;mso-wrap-distance-top:0;mso-wrap-distance-right:9pt;mso-wrap-distance-bottom:0;mso-position-horizontal:absolute;mso-position-horizontal-relative:text;mso-position-vertical:absolute;mso-position-vertical-relative:text;v-text-anchor:middle" coordsize="6672793,2097040" o:gfxdata="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" path="m6503202,9526v28886,-6973,57772,-13945,83670,-5976c6612770,11519,6644645,20483,6658590,57338v13945,36855,16933,94627,11953,167341c6665563,297393,6660582,421902,6628708,493620v-31874,71718,-66738,128494,-149412,161365c6396622,687856,6281077,683872,6132661,690844v-148416,6972,-351616,6972,-543859,5976c5396559,695824,4979202,684868,4979202,684868r-573741,-5977l3777931,666938v-197224,-1992,-555812,,-555812,l2600566,666938r-663388,l1214025,660962c1003853,657974,843484,638052,676143,649009,508802,659966,316558,673911,209978,726703,103398,779495,71524,868146,36661,965762,1798,1063378,-2186,1205817,802,1312397v2988,106580,30878,204196,53788,292847c77500,1693895,104394,1784538,138261,1844303v33867,59765,85662,87655,119529,119529c291657,1995706,310582,2016625,341461,2035550v30878,18926,72714,31874,101600,41835c471947,2087346,493860,2092327,514778,2095315v20918,2988,37353,1494,53788,e" filled="f" strokecolor="#030e13 [484]" strokeweight=".5pt">
                 <v:stroke opacity="31868f" joinstyle="miter"/>
                 <v:path arrowok="t" o:connecttype="custom" o:connectlocs="6503202,9526;6586872,3550;6658590,57338;6670543,224679;6628708,493620;6479296,654985;6132661,690844;5588802,696820;4979202,684868;4405461,678891;3777931,666938;3222119,666938;2600566,666938;1937178,666938;1214025,660962;676143,649009;209978,726703;36661,965762;802,1312397;54590,1605244;138261,1844303;257790,1963832;341461,2035550;443061,2077385;514778,2095315;568566,2095315" o:connectangles="0,0,0,0,0,0,0,0,0,0,0,0,0,0,0,0,0,0,0,0,0,0,0,0,0,0"/>
               </v:shape>
@@ -19726,7 +19972,7 @@
           </mc:Choice>
           <mc:Fallback>
             <w:pict>
-              <v:shape w14:anchorId="15654D03" id="Freeform 28" o:spid="_x0000_s1026" style="position:absolute;margin-left:-21.05pt;margin-top:70.2pt;width:516.2pt;height:155.95pt;z-index:251704320;visibility:visible;mso-wrap-style:square;mso-wrap-distance-left:9pt;mso-wrap-distance-top:0;mso-wrap-distance-right:9pt;mso-wrap-distance-bottom:0;mso-position-horizontal:absolute;mso-position-horizontal-relative:text;mso-position-vertical:absolute;mso-position-vertical-relative:text;v-text-anchor:middle" coordsize="6555831,1980354" o:gfxdata="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" path="m6207906,v83670,87156,167341,174313,215153,245035c6470871,315757,6472862,346636,6494776,424330v21914,77694,53789,202203,59765,286870c6560517,795867,6544580,859616,6530635,932330v-13945,72714,-28887,153395,-59765,215152c6439992,1209239,6411106,1268008,6345365,1302871v-65741,34863,-167342,41835,-268942,53788c5974823,1368612,5867247,1373592,5735765,1374588v-131482,996,-448236,-11953,-448236,-11953l4689882,1350682r-651435,l3488612,1356659v-190251,,-591671,-5977,-591671,-5977l2143906,1350682v-231090,1992,-633506,11953,-633506,11953l841035,1362635v-197223,,-392455,-5976,-513976,c205538,1368611,165694,1359647,111906,1398494,58118,1437341,18274,1529977,4329,1595718v-13945,65741,8965,144431,23906,197223c43176,1845733,64094,1882589,93976,1912471v29882,29882,84667,48807,113553,59764c236415,1983192,251854,1980702,267294,1978212e" filled="f" strokecolor="#030e13 [484]" strokeweight=".5pt">
+              <v:shape w14:anchorId="5CFE14CA" id="Freeform 28" o:spid="_x0000_s1026" style="position:absolute;margin-left:-21.05pt;margin-top:70.2pt;width:516.2pt;height:155.95pt;z-index:251704320;visibility:visible;mso-wrap-style:square;mso-wrap-distance-left:9pt;mso-wrap-distance-top:0;mso-wrap-distance-right:9pt;mso-wrap-distance-bottom:0;mso-position-horizontal:absolute;mso-position-horizontal-relative:text;mso-position-vertical:absolute;mso-position-vertical-relative:text;v-text-anchor:middle" coordsize="6555831,1980354" o:gfxdata="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" path="m6207906,v83670,87156,167341,174313,215153,245035c6470871,315757,6472862,346636,6494776,424330v21914,77694,53789,202203,59765,286870c6560517,795867,6544580,859616,6530635,932330v-13945,72714,-28887,153395,-59765,215152c6439992,1209239,6411106,1268008,6345365,1302871v-65741,34863,-167342,41835,-268942,53788c5974823,1368612,5867247,1373592,5735765,1374588v-131482,996,-448236,-11953,-448236,-11953l4689882,1350682r-651435,l3488612,1356659v-190251,,-591671,-5977,-591671,-5977l2143906,1350682v-231090,1992,-633506,11953,-633506,11953l841035,1362635v-197223,,-392455,-5976,-513976,c205538,1368611,165694,1359647,111906,1398494,58118,1437341,18274,1529977,4329,1595718v-13945,65741,8965,144431,23906,197223c43176,1845733,64094,1882589,93976,1912471v29882,29882,84667,48807,113553,59764c236415,1983192,251854,1980702,267294,1978212e" filled="f" strokecolor="#030e13 [484]" strokeweight=".5pt">
                 <v:stroke opacity="29555f" joinstyle="miter"/>
                 <v:path arrowok="t" o:connecttype="custom" o:connectlocs="6207906,0;6423059,245035;6494776,424330;6554541,711200;6530635,932330;6470870,1147482;6345365,1302871;6076423,1356659;5735765,1374588;5287529,1362635;4689882,1350682;4038447,1350682;3488612,1356659;2896941,1350682;2143906,1350682;1510400,1362635;841035,1362635;327059,1362635;111906,1398494;4329,1595718;28235,1792941;93976,1912471;207529,1972235;267294,1978212" o:connectangles="0,0,0,0,0,0,0,0,0,0,0,0,0,0,0,0,0,0,0,0,0,0,0,0"/>
               </v:shape>
@@ -20100,7 +20346,7 @@
           </mc:Choice>
           <mc:Fallback>
             <w:pict>
-              <v:shape w14:anchorId="2CE365BC" id="Freeform 30" o:spid="_x0000_s1026" style="position:absolute;margin-left:-46.15pt;margin-top:99.85pt;width:536.35pt;height:149.65pt;z-index:251706368;visibility:visible;mso-wrap-style:square;mso-wrap-distance-left:9pt;mso-wrap-distance-top:0;mso-wrap-distance-right:9pt;mso-wrap-distance-bottom:0;mso-position-horizontal:absolute;mso-position-horizontal-relative:text;mso-position-vertical:absolute;mso-position-vertical-relative:text;v-text-anchor:middle" coordsize="6811425,1900517" o:gfxdata="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" path="m6514971,v92137,19423,184274,38847,233082,59765c6796861,80683,6798853,102596,6807818,125506v8965,22910,-997,43827,-5977,71717c6796861,225113,6792877,249020,6777936,292847v-14941,43827,-36856,118533,-65742,167341c6683308,508996,6655418,556808,6604618,585694v-50800,28886,-84667,35859,-197224,47812c6294837,645459,6152398,651436,5929277,657412v-223121,5976,-543859,11953,-860612,11953c4751912,669365,4028759,657412,4028759,657412r-1165412,l1500712,657412r-890494,5976c403034,676337,350241,686298,257606,735106,164971,783914,97237,862604,54406,956235,11575,1049866,-3366,1181349,618,1296894v3984,115545,41835,263961,77694,352612c114171,1738157,173936,1791945,215771,1828800v41835,36855,72714,30878,113553,41835c370163,1881592,417975,1889561,460806,1894541v42831,4980,84168,5478,125506,5976e" filled="f" strokecolor="#030e13 [484]" strokeweight=".5pt">
+              <v:shape w14:anchorId="75834254" id="Freeform 30" o:spid="_x0000_s1026" style="position:absolute;margin-left:-46.15pt;margin-top:99.85pt;width:536.35pt;height:149.65pt;z-index:251706368;visibility:visible;mso-wrap-style:square;mso-wrap-distance-left:9pt;mso-wrap-distance-top:0;mso-wrap-distance-right:9pt;mso-wrap-distance-bottom:0;mso-position-horizontal:absolute;mso-position-horizontal-relative:text;mso-position-vertical:absolute;mso-position-vertical-relative:text;v-text-anchor:middle" coordsize="6811425,1900517" o:gfxdata="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" path="m6514971,v92137,19423,184274,38847,233082,59765c6796861,80683,6798853,102596,6807818,125506v8965,22910,-997,43827,-5977,71717c6796861,225113,6792877,249020,6777936,292847v-14941,43827,-36856,118533,-65742,167341c6683308,508996,6655418,556808,6604618,585694v-50800,28886,-84667,35859,-197224,47812c6294837,645459,6152398,651436,5929277,657412v-223121,5976,-543859,11953,-860612,11953c4751912,669365,4028759,657412,4028759,657412r-1165412,l1500712,657412r-890494,5976c403034,676337,350241,686298,257606,735106,164971,783914,97237,862604,54406,956235,11575,1049866,-3366,1181349,618,1296894v3984,115545,41835,263961,77694,352612c114171,1738157,173936,1791945,215771,1828800v41835,36855,72714,30878,113553,41835c370163,1881592,417975,1889561,460806,1894541v42831,4980,84168,5478,125506,5976e" filled="f" strokecolor="#030e13 [484]" strokeweight=".5pt">
                 <v:stroke opacity="34181f" joinstyle="miter"/>
                 <v:path arrowok="t" o:connecttype="custom" o:connectlocs="6514971,0;6748053,59765;6807818,125506;6801841,197223;6777936,292847;6712194,460188;6604618,585694;6407394,633506;5929277,657412;5068665,669365;4028759,657412;2863347,657412;1500712,657412;610218,663388;257606,735106;54406,956235;618,1296894;78312,1649506;215771,1828800;329324,1870635;460806,1894541;586312,1900517" o:connectangles="0,0,0,0,0,0,0,0,0,0,0,0,0,0,0,0,0,0,0,0,0,0"/>
               </v:shape>
@@ -20437,9 +20683,15 @@
         </w:drawing>
       </w:r>
     </w:p>
-    <w:p/>
-    <w:p/>
-    <w:p/>
+    <w:p>
+      <w:pPr>
+        <w:pStyle w:val="Heading1"/>
+      </w:pPr>
+      <w:r>
+        <w:lastRenderedPageBreak/>
+        <w:t>Interpreting the Results of Agentic RL System Execution</w:t>
+      </w:r>
+    </w:p>
     <w:p/>
     <w:p/>
     <w:p/>
@@ -20763,7 +21015,6 @@
     </w:p>
     <w:p>
       <w:r>
-        <w:lastRenderedPageBreak/>
         <w:t xml:space="preserve">[17] </w:t>
       </w:r>
       <w:hyperlink r:id="rId38" w:history="1">
@@ -21194,7 +21445,7 @@
           </mc:Choice>
           <mc:Fallback>
             <w:pict>
-              <v:shape w14:anchorId="53157B3F" id="Freeform 3" o:spid="_x0000_s1026" style="position:absolute;margin-left:71.05pt;margin-top:3.35pt;width:110.75pt;height:26pt;z-index:251665408;visibility:visible;mso-wrap-style:square;mso-wrap-distance-left:9pt;mso-wrap-distance-top:0;mso-wrap-distance-right:9pt;mso-wrap-distance-bottom:0;mso-position-horizontal:absolute;mso-position-horizontal-relative:text;mso-position-vertical:absolute;mso-position-vertical-relative:text;v-text-anchor:middle" coordsize="1406771,330481" o:gfxdata="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" path="m,324504c6474,267230,12949,209956,65741,163140,118533,116324,217145,70504,316753,43610,416361,16716,560792,6755,663388,1775v102596,-4980,183278,996,268941,11953c1017992,24685,1117600,48591,1177365,67516v59765,18925,79686,35859,113553,59765c1324785,151187,1361640,183061,1380565,210951v18925,27890,23906,83671,23906,83671c1408455,314544,1406463,322512,1404471,330481e" filled="f" strokecolor="#030e13 [484]" strokeweight="1pt">
+              <v:shape w14:anchorId="11874E17" id="Freeform 3" o:spid="_x0000_s1026" style="position:absolute;margin-left:71.05pt;margin-top:3.35pt;width:110.75pt;height:26pt;z-index:251665408;visibility:visible;mso-wrap-style:square;mso-wrap-distance-left:9pt;mso-wrap-distance-top:0;mso-wrap-distance-right:9pt;mso-wrap-distance-bottom:0;mso-position-horizontal:absolute;mso-position-horizontal-relative:text;mso-position-vertical:absolute;mso-position-vertical-relative:text;v-text-anchor:middle" coordsize="1406771,330481" o:gfxdata="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" path="m,324504c6474,267230,12949,209956,65741,163140,118533,116324,217145,70504,316753,43610,416361,16716,560792,6755,663388,1775v102596,-4980,183278,996,268941,11953c1017992,24685,1117600,48591,1177365,67516v59765,18925,79686,35859,113553,59765c1324785,151187,1361640,183061,1380565,210951v18925,27890,23906,83671,23906,83671c1408455,314544,1406463,322512,1404471,330481e" filled="f" strokecolor="#030e13 [484]" strokeweight="1pt">
                 <v:stroke endarrow="block" endarrowwidth="narrow" endarrowlength="short" joinstyle="miter"/>
                 <v:path arrowok="t" o:connecttype="custom" o:connectlocs="0,324504;65741,163140;316753,43610;663388,1775;932329,13728;1177365,67516;1290918,127281;1380565,210951;1404471,294622;1404471,330481" o:connectangles="0,0,0,0,0,0,0,0,0,0"/>
               </v:shape>
@@ -21635,7 +21886,7 @@
           </mc:Choice>
           <mc:Fallback>
             <w:pict>
-              <v:shape w14:anchorId="26A8F256" id="Freeform 4" o:spid="_x0000_s1026" style="position:absolute;margin-left:70.45pt;margin-top:3.2pt;width:111.2pt;height:25pt;z-index:251666432;visibility:visible;mso-wrap-style:square;mso-wrap-distance-left:9pt;mso-wrap-distance-top:0;mso-wrap-distance-right:9pt;mso-wrap-distance-bottom:0;mso-position-horizontal:absolute;mso-position-horizontal-relative:text;mso-position-vertical:absolute;mso-position-vertical-relative:text;v-text-anchor:middle" coordsize="1412408,317188" o:gfxdata="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" path="m1412217,v498,46816,996,93632,-11953,125506c1387315,157380,1374366,169333,1334523,191247v-39843,21914,-108573,48808,-173318,65741c1096460,273921,1060601,282886,946052,292847v-114549,9961,-356596,21914,-472141,23906c358366,318745,312546,313765,252781,304800,193016,295835,153174,286871,115323,262965,77472,239059,44600,190251,25675,161365,6750,132479,5754,112557,1770,89647v-3984,-22910,,-65741,,-65741l1770,11953e" filled="f" strokecolor="#030e13 [484]" strokeweight="1pt">
+              <v:shape w14:anchorId="351EDE97" id="Freeform 4" o:spid="_x0000_s1026" style="position:absolute;margin-left:70.45pt;margin-top:3.2pt;width:111.2pt;height:25pt;z-index:251666432;visibility:visible;mso-wrap-style:square;mso-wrap-distance-left:9pt;mso-wrap-distance-top:0;mso-wrap-distance-right:9pt;mso-wrap-distance-bottom:0;mso-position-horizontal:absolute;mso-position-horizontal-relative:text;mso-position-vertical:absolute;mso-position-vertical-relative:text;v-text-anchor:middle" coordsize="1412408,317188" o:gfxdata="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" path="m1412217,v498,46816,996,93632,-11953,125506c1387315,157380,1374366,169333,1334523,191247v-39843,21914,-108573,48808,-173318,65741c1096460,273921,1060601,282886,946052,292847v-114549,9961,-356596,21914,-472141,23906c358366,318745,312546,313765,252781,304800,193016,295835,153174,286871,115323,262965,77472,239059,44600,190251,25675,161365,6750,132479,5754,112557,1770,89647v-3984,-22910,,-65741,,-65741l1770,11953e" filled="f" strokecolor="#030e13 [484]" strokeweight="1pt">
                 <v:stroke endarrow="block" endarrowwidth="narrow" endarrowlength="short" joinstyle="miter"/>
                 <v:path arrowok="t" o:connecttype="custom" o:connectlocs="1412217,0;1400264,125506;1334523,191247;1161205,256988;946052,292847;473911,316753;252781,304800;115323,262965;25675,161365;1770,89647;1770,23906;1770,11953" o:connectangles="0,0,0,0,0,0,0,0,0,0,0,0"/>
               </v:shape>
@@ -21855,7 +22106,6 @@
           <w:b/>
           <w:bCs/>
         </w:rPr>
-        <w:lastRenderedPageBreak/>
         <w:t>Definition</w:t>
       </w:r>
       <w:r>
@@ -21871,6 +22121,7 @@
     </w:p>
     <w:p>
       <w:r>
+        <w:lastRenderedPageBreak/>
         <w:t>An observation</w:t>
       </w:r>
       <w:r>
@@ -39729,7 +39980,7 @@
 </file>
 
 <file path=customXml/itemProps1.xml><?xml version="1.0" encoding="utf-8"?>
-<ds:datastoreItem xmlns:ds="http://schemas.openxmlformats.org/officeDocument/2006/customXml" ds:itemID="{FBDC0FB5-1CA4-7040-9A5E-9F0E8693AC0F}">
+<ds:datastoreItem xmlns:ds="http://schemas.openxmlformats.org/officeDocument/2006/customXml" ds:itemID="{64F6F5FA-FB42-FD41-A0E0-CE064C46CE41}">
   <ds:schemaRefs>
     <ds:schemaRef ds:uri="http://schemas.openxmlformats.org/officeDocument/2006/bibliography"/>
   </ds:schemaRefs>

</xml_diff>